<commit_message>
sistemazione api e commenti
</commit_message>
<xml_diff>
--- a/Relazione Progetto FastFood.docx
+++ b/Relazione Progetto FastFood.docx
@@ -91,15 +91,31 @@
           <w:sz w:val="20"/>
           <w:szCs w:val="8"/>
         </w:rPr>
-        <w:t>°</w:t>
-      </w:r>
-      <w:r>
-        <w:rPr>
-          <w:rFonts w:asciiTheme="minorHAnsi" w:hAnsiTheme="minorHAnsi" w:cstheme="minorHAnsi"/>
-          <w:sz w:val="20"/>
-          <w:szCs w:val="8"/>
-        </w:rPr>
-        <w:t>) e Fabrizio Idà ()</w:t>
+        <w:t>A</w:t>
+      </w:r>
+      <w:r>
+        <w:rPr>
+          <w:rFonts w:asciiTheme="minorHAnsi" w:hAnsiTheme="minorHAnsi" w:cstheme="minorHAnsi"/>
+          <w:sz w:val="20"/>
+          <w:szCs w:val="8"/>
+        </w:rPr>
+        <w:t>) e Fabrizio Idà (</w:t>
+      </w:r>
+      <w:r>
+        <w:rPr>
+          <w:rFonts w:asciiTheme="minorHAnsi" w:hAnsiTheme="minorHAnsi" w:cstheme="minorHAnsi"/>
+          <w:sz w:val="20"/>
+          <w:szCs w:val="8"/>
+        </w:rPr>
+        <w:t>48264A</w:t>
+      </w:r>
+      <w:r>
+        <w:rPr>
+          <w:rFonts w:asciiTheme="minorHAnsi" w:hAnsiTheme="minorHAnsi" w:cstheme="minorHAnsi"/>
+          <w:sz w:val="20"/>
+          <w:szCs w:val="8"/>
+        </w:rPr>
+        <w:t>)</w:t>
       </w:r>
       <w:r>
         <w:rPr>
@@ -181,7 +197,25 @@
           <w:sz w:val="20"/>
           <w:szCs w:val="8"/>
         </w:rPr>
-        <w:t xml:space="preserve">Il progetto “FastFood” consiste nello sviluppo di un’applicazione web per la gestione di un servizio di </w:t>
+        <w:t>Il progetto “</w:t>
+      </w:r>
+      <w:proofErr w:type="spellStart"/>
+      <w:r>
+        <w:rPr>
+          <w:rFonts w:asciiTheme="minorHAnsi" w:hAnsiTheme="minorHAnsi" w:cstheme="minorHAnsi"/>
+          <w:sz w:val="20"/>
+          <w:szCs w:val="8"/>
+        </w:rPr>
+        <w:t>FastFood</w:t>
+      </w:r>
+      <w:proofErr w:type="spellEnd"/>
+      <w:r>
+        <w:rPr>
+          <w:rFonts w:asciiTheme="minorHAnsi" w:hAnsiTheme="minorHAnsi" w:cstheme="minorHAnsi"/>
+          <w:sz w:val="20"/>
+          <w:szCs w:val="8"/>
+        </w:rPr>
+        <w:t xml:space="preserve">” consiste nello sviluppo di un’applicazione web per la gestione di un servizio di </w:t>
       </w:r>
       <w:r>
         <w:rPr>
@@ -291,6 +325,7 @@
         </w:rPr>
         <w:t xml:space="preserve">L’applicazione segue un’architettura Client-Server di tipo </w:t>
       </w:r>
+      <w:proofErr w:type="spellStart"/>
       <w:r>
         <w:rPr>
           <w:rFonts w:asciiTheme="minorHAnsi" w:hAnsiTheme="minorHAnsi" w:cstheme="minorHAnsi"/>
@@ -300,13 +335,50 @@
         </w:rPr>
         <w:t>RESTful</w:t>
       </w:r>
-      <w:r>
-        <w:rPr>
-          <w:rFonts w:asciiTheme="minorHAnsi" w:hAnsiTheme="minorHAnsi" w:cstheme="minorHAnsi"/>
-          <w:sz w:val="20"/>
-          <w:szCs w:val="8"/>
-        </w:rPr>
-        <w:t>. Il frontend e il backend sono separati logicamente e comunicano tramite richieste HTTP con dati in formato JSON. Questa separazione garantisce maggiore modularità, scalabilità e chiarezza nella gestione del codice.</w:t>
+      <w:proofErr w:type="spellEnd"/>
+      <w:r>
+        <w:rPr>
+          <w:rFonts w:asciiTheme="minorHAnsi" w:hAnsiTheme="minorHAnsi" w:cstheme="minorHAnsi"/>
+          <w:sz w:val="20"/>
+          <w:szCs w:val="8"/>
+        </w:rPr>
+        <w:t xml:space="preserve">. Il </w:t>
+      </w:r>
+      <w:proofErr w:type="spellStart"/>
+      <w:r>
+        <w:rPr>
+          <w:rFonts w:asciiTheme="minorHAnsi" w:hAnsiTheme="minorHAnsi" w:cstheme="minorHAnsi"/>
+          <w:sz w:val="20"/>
+          <w:szCs w:val="8"/>
+        </w:rPr>
+        <w:t>frontend</w:t>
+      </w:r>
+      <w:proofErr w:type="spellEnd"/>
+      <w:r>
+        <w:rPr>
+          <w:rFonts w:asciiTheme="minorHAnsi" w:hAnsiTheme="minorHAnsi" w:cstheme="minorHAnsi"/>
+          <w:sz w:val="20"/>
+          <w:szCs w:val="8"/>
+        </w:rPr>
+        <w:t xml:space="preserve"> e il </w:t>
+      </w:r>
+      <w:proofErr w:type="spellStart"/>
+      <w:r>
+        <w:rPr>
+          <w:rFonts w:asciiTheme="minorHAnsi" w:hAnsiTheme="minorHAnsi" w:cstheme="minorHAnsi"/>
+          <w:sz w:val="20"/>
+          <w:szCs w:val="8"/>
+        </w:rPr>
+        <w:t>backend</w:t>
+      </w:r>
+      <w:proofErr w:type="spellEnd"/>
+      <w:r>
+        <w:rPr>
+          <w:rFonts w:asciiTheme="minorHAnsi" w:hAnsiTheme="minorHAnsi" w:cstheme="minorHAnsi"/>
+          <w:sz w:val="20"/>
+          <w:szCs w:val="8"/>
+        </w:rPr>
+        <w:t xml:space="preserve"> sono separati logicamente e comunicano tramite richieste HTTP con dati in formato JSON. Questa separazione garantisce maggiore modularità, scalabilità e chiarezza nella gestione del codice.</w:t>
       </w:r>
     </w:p>
     <w:p>
@@ -376,8 +448,18 @@
           <w:sz w:val="20"/>
           <w:szCs w:val="8"/>
         </w:rPr>
-        <w:t>2.1 Frontend</w:t>
-      </w:r>
+        <w:t xml:space="preserve">2.1 </w:t>
+      </w:r>
+      <w:proofErr w:type="spellStart"/>
+      <w:r>
+        <w:rPr>
+          <w:rFonts w:asciiTheme="minorHAnsi" w:hAnsiTheme="minorHAnsi" w:cstheme="minorHAnsi"/>
+          <w:sz w:val="20"/>
+          <w:szCs w:val="8"/>
+        </w:rPr>
+        <w:t>Frontend</w:t>
+      </w:r>
+      <w:proofErr w:type="spellEnd"/>
     </w:p>
     <w:p>
       <w:pPr>
@@ -489,7 +571,25 @@
           <w:sz w:val="20"/>
           <w:szCs w:val="8"/>
         </w:rPr>
-        <w:t>Inoltre, ha permesso di utilizzare componenti predefiniti come Navbar, Card</w:t>
+        <w:t xml:space="preserve">Inoltre, ha permesso di utilizzare componenti predefiniti come </w:t>
+      </w:r>
+      <w:proofErr w:type="spellStart"/>
+      <w:r>
+        <w:rPr>
+          <w:rFonts w:asciiTheme="minorHAnsi" w:hAnsiTheme="minorHAnsi" w:cstheme="minorHAnsi"/>
+          <w:sz w:val="20"/>
+          <w:szCs w:val="8"/>
+        </w:rPr>
+        <w:t>Navbar</w:t>
+      </w:r>
+      <w:proofErr w:type="spellEnd"/>
+      <w:r>
+        <w:rPr>
+          <w:rFonts w:asciiTheme="minorHAnsi" w:hAnsiTheme="minorHAnsi" w:cstheme="minorHAnsi"/>
+          <w:sz w:val="20"/>
+          <w:szCs w:val="8"/>
+        </w:rPr>
+        <w:t>, Card</w:t>
       </w:r>
       <w:r>
         <w:rPr>
@@ -540,59 +640,123 @@
           <w:szCs w:val="8"/>
         </w:rPr>
         <w:br/>
-        <w:t>Gestisce tutta la logica lato client. Le richieste verso il server vengono effettuate tramite l’API fetch, utilizzando la sintassi async/await per gestire le operazioni asincrone in modo ordinato e leggibile.</w:t>
-      </w:r>
-    </w:p>
-    <w:p>
-      <w:pPr>
-        <w:rPr>
-          <w:rFonts w:asciiTheme="minorHAnsi" w:hAnsiTheme="minorHAnsi" w:cstheme="minorHAnsi"/>
-          <w:sz w:val="20"/>
-          <w:szCs w:val="8"/>
-        </w:rPr>
-      </w:pPr>
-    </w:p>
-    <w:p>
-      <w:pPr>
-        <w:rPr>
-          <w:rFonts w:asciiTheme="minorHAnsi" w:hAnsiTheme="minorHAnsi" w:cstheme="minorHAnsi"/>
-          <w:sz w:val="20"/>
-          <w:szCs w:val="8"/>
-        </w:rPr>
-      </w:pPr>
-      <w:r>
-        <w:rPr>
-          <w:rFonts w:asciiTheme="minorHAnsi" w:hAnsiTheme="minorHAnsi" w:cstheme="minorHAnsi"/>
-          <w:sz w:val="20"/>
-          <w:szCs w:val="8"/>
-        </w:rPr>
-        <w:t>2.2 Backend</w:t>
-      </w:r>
-    </w:p>
-    <w:p>
-      <w:pPr>
-        <w:rPr>
-          <w:rFonts w:asciiTheme="minorHAnsi" w:hAnsiTheme="minorHAnsi" w:cstheme="minorHAnsi"/>
-          <w:sz w:val="20"/>
-          <w:szCs w:val="8"/>
-        </w:rPr>
-      </w:pPr>
-    </w:p>
-    <w:p>
-      <w:pPr>
-        <w:rPr>
-          <w:rFonts w:asciiTheme="minorHAnsi" w:hAnsiTheme="minorHAnsi" w:cstheme="minorHAnsi"/>
-          <w:sz w:val="20"/>
-          <w:szCs w:val="8"/>
-        </w:rPr>
-      </w:pPr>
-      <w:r>
-        <w:rPr>
-          <w:rFonts w:asciiTheme="minorHAnsi" w:hAnsiTheme="minorHAnsi" w:cstheme="minorHAnsi"/>
-          <w:sz w:val="20"/>
-          <w:szCs w:val="8"/>
-        </w:rPr>
-        <w:t xml:space="preserve">Il backend </w:t>
+        <w:t xml:space="preserve">Gestisce tutta la logica lato client. Le richieste verso il server vengono effettuate tramite l’API fetch, utilizzando la sintassi </w:t>
+      </w:r>
+      <w:proofErr w:type="spellStart"/>
+      <w:r>
+        <w:rPr>
+          <w:rFonts w:asciiTheme="minorHAnsi" w:hAnsiTheme="minorHAnsi" w:cstheme="minorHAnsi"/>
+          <w:sz w:val="20"/>
+          <w:szCs w:val="8"/>
+        </w:rPr>
+        <w:t>async</w:t>
+      </w:r>
+      <w:proofErr w:type="spellEnd"/>
+      <w:r>
+        <w:rPr>
+          <w:rFonts w:asciiTheme="minorHAnsi" w:hAnsiTheme="minorHAnsi" w:cstheme="minorHAnsi"/>
+          <w:sz w:val="20"/>
+          <w:szCs w:val="8"/>
+        </w:rPr>
+        <w:t>/</w:t>
+      </w:r>
+      <w:proofErr w:type="spellStart"/>
+      <w:r>
+        <w:rPr>
+          <w:rFonts w:asciiTheme="minorHAnsi" w:hAnsiTheme="minorHAnsi" w:cstheme="minorHAnsi"/>
+          <w:sz w:val="20"/>
+          <w:szCs w:val="8"/>
+        </w:rPr>
+        <w:t>await</w:t>
+      </w:r>
+      <w:proofErr w:type="spellEnd"/>
+      <w:r>
+        <w:rPr>
+          <w:rFonts w:asciiTheme="minorHAnsi" w:hAnsiTheme="minorHAnsi" w:cstheme="minorHAnsi"/>
+          <w:sz w:val="20"/>
+          <w:szCs w:val="8"/>
+        </w:rPr>
+        <w:t xml:space="preserve"> per gestire le operazioni asincrone in modo ordinato e leggibile.</w:t>
+      </w:r>
+    </w:p>
+    <w:p>
+      <w:pPr>
+        <w:rPr>
+          <w:rFonts w:asciiTheme="minorHAnsi" w:hAnsiTheme="minorHAnsi" w:cstheme="minorHAnsi"/>
+          <w:sz w:val="20"/>
+          <w:szCs w:val="8"/>
+        </w:rPr>
+      </w:pPr>
+    </w:p>
+    <w:p>
+      <w:pPr>
+        <w:rPr>
+          <w:rFonts w:asciiTheme="minorHAnsi" w:hAnsiTheme="minorHAnsi" w:cstheme="minorHAnsi"/>
+          <w:sz w:val="20"/>
+          <w:szCs w:val="8"/>
+        </w:rPr>
+      </w:pPr>
+      <w:r>
+        <w:rPr>
+          <w:rFonts w:asciiTheme="minorHAnsi" w:hAnsiTheme="minorHAnsi" w:cstheme="minorHAnsi"/>
+          <w:sz w:val="20"/>
+          <w:szCs w:val="8"/>
+        </w:rPr>
+        <w:t xml:space="preserve">2.2 </w:t>
+      </w:r>
+      <w:proofErr w:type="spellStart"/>
+      <w:r>
+        <w:rPr>
+          <w:rFonts w:asciiTheme="minorHAnsi" w:hAnsiTheme="minorHAnsi" w:cstheme="minorHAnsi"/>
+          <w:sz w:val="20"/>
+          <w:szCs w:val="8"/>
+        </w:rPr>
+        <w:t>Backend</w:t>
+      </w:r>
+      <w:proofErr w:type="spellEnd"/>
+    </w:p>
+    <w:p>
+      <w:pPr>
+        <w:rPr>
+          <w:rFonts w:asciiTheme="minorHAnsi" w:hAnsiTheme="minorHAnsi" w:cstheme="minorHAnsi"/>
+          <w:sz w:val="20"/>
+          <w:szCs w:val="8"/>
+        </w:rPr>
+      </w:pPr>
+    </w:p>
+    <w:p>
+      <w:pPr>
+        <w:rPr>
+          <w:rFonts w:asciiTheme="minorHAnsi" w:hAnsiTheme="minorHAnsi" w:cstheme="minorHAnsi"/>
+          <w:sz w:val="20"/>
+          <w:szCs w:val="8"/>
+        </w:rPr>
+      </w:pPr>
+      <w:r>
+        <w:rPr>
+          <w:rFonts w:asciiTheme="minorHAnsi" w:hAnsiTheme="minorHAnsi" w:cstheme="minorHAnsi"/>
+          <w:sz w:val="20"/>
+          <w:szCs w:val="8"/>
+        </w:rPr>
+        <w:t xml:space="preserve">Il </w:t>
+      </w:r>
+      <w:proofErr w:type="spellStart"/>
+      <w:r>
+        <w:rPr>
+          <w:rFonts w:asciiTheme="minorHAnsi" w:hAnsiTheme="minorHAnsi" w:cstheme="minorHAnsi"/>
+          <w:sz w:val="20"/>
+          <w:szCs w:val="8"/>
+        </w:rPr>
+        <w:t>backend</w:t>
+      </w:r>
+      <w:proofErr w:type="spellEnd"/>
+      <w:r>
+        <w:rPr>
+          <w:rFonts w:asciiTheme="minorHAnsi" w:hAnsiTheme="minorHAnsi" w:cstheme="minorHAnsi"/>
+          <w:sz w:val="20"/>
+          <w:szCs w:val="8"/>
+        </w:rPr>
+        <w:t xml:space="preserve"> </w:t>
       </w:r>
       <w:r>
         <w:rPr>
@@ -661,7 +825,25 @@
           <w:szCs w:val="8"/>
         </w:rPr>
         <w:br/>
-        <w:t>Permette di eseguire codice JavaScript lato server. È stato scelto per la sua efficienza nella gestione delle operazioni asincrone e per la coerenza con il linguaggio utilizzato nel frontend.</w:t>
+        <w:t xml:space="preserve">Permette di eseguire codice JavaScript lato server. È stato scelto per la sua efficienza nella gestione delle operazioni asincrone e per la coerenza con il linguaggio utilizzato nel </w:t>
+      </w:r>
+      <w:proofErr w:type="spellStart"/>
+      <w:r>
+        <w:rPr>
+          <w:rFonts w:asciiTheme="minorHAnsi" w:hAnsiTheme="minorHAnsi" w:cstheme="minorHAnsi"/>
+          <w:sz w:val="20"/>
+          <w:szCs w:val="8"/>
+        </w:rPr>
+        <w:t>frontend</w:t>
+      </w:r>
+      <w:proofErr w:type="spellEnd"/>
+      <w:r>
+        <w:rPr>
+          <w:rFonts w:asciiTheme="minorHAnsi" w:hAnsiTheme="minorHAnsi" w:cstheme="minorHAnsi"/>
+          <w:sz w:val="20"/>
+          <w:szCs w:val="8"/>
+        </w:rPr>
+        <w:t>.</w:t>
       </w:r>
     </w:p>
     <w:p>
@@ -808,7 +990,25 @@
           <w:sz w:val="20"/>
           <w:szCs w:val="8"/>
         </w:rPr>
-        <w:t>Modulo File System (fs)</w:t>
+        <w:t>Modulo File System (</w:t>
+      </w:r>
+      <w:proofErr w:type="spellStart"/>
+      <w:r>
+        <w:rPr>
+          <w:rFonts w:asciiTheme="minorHAnsi" w:hAnsiTheme="minorHAnsi" w:cstheme="minorHAnsi"/>
+          <w:sz w:val="20"/>
+          <w:szCs w:val="8"/>
+        </w:rPr>
+        <w:t>fs</w:t>
+      </w:r>
+      <w:proofErr w:type="spellEnd"/>
+      <w:r>
+        <w:rPr>
+          <w:rFonts w:asciiTheme="minorHAnsi" w:hAnsiTheme="minorHAnsi" w:cstheme="minorHAnsi"/>
+          <w:sz w:val="20"/>
+          <w:szCs w:val="8"/>
+        </w:rPr>
+        <w:t>)</w:t>
       </w:r>
       <w:r>
         <w:rPr>
@@ -864,13 +1064,23 @@
           <w:szCs w:val="8"/>
         </w:rPr>
       </w:pPr>
-      <w:r>
-        <w:rPr>
-          <w:rFonts w:asciiTheme="minorHAnsi" w:hAnsiTheme="minorHAnsi" w:cstheme="minorHAnsi"/>
-          <w:sz w:val="20"/>
-          <w:szCs w:val="8"/>
-        </w:rPr>
-        <w:t>MongoDB Atlas</w:t>
+      <w:proofErr w:type="spellStart"/>
+      <w:r>
+        <w:rPr>
+          <w:rFonts w:asciiTheme="minorHAnsi" w:hAnsiTheme="minorHAnsi" w:cstheme="minorHAnsi"/>
+          <w:sz w:val="20"/>
+          <w:szCs w:val="8"/>
+        </w:rPr>
+        <w:t>MongoDB</w:t>
+      </w:r>
+      <w:proofErr w:type="spellEnd"/>
+      <w:r>
+        <w:rPr>
+          <w:rFonts w:asciiTheme="minorHAnsi" w:hAnsiTheme="minorHAnsi" w:cstheme="minorHAnsi"/>
+          <w:sz w:val="20"/>
+          <w:szCs w:val="8"/>
+        </w:rPr>
+        <w:t xml:space="preserve"> Atlas</w:t>
       </w:r>
       <w:r>
         <w:rPr>
@@ -879,33 +1089,79 @@
           <w:szCs w:val="8"/>
         </w:rPr>
         <w:br/>
-        <w:t>È stato utilizzato un database NoSQL in cloud. La struttura a documenti ha permesso una modellazione flessibile dei dati, adattabile alle diverse esigenze dell’applicazione.</w:t>
-      </w:r>
-    </w:p>
-    <w:p>
-      <w:pPr>
-        <w:rPr>
-          <w:rFonts w:asciiTheme="minorHAnsi" w:hAnsiTheme="minorHAnsi" w:cstheme="minorHAnsi"/>
-          <w:sz w:val="20"/>
-          <w:szCs w:val="8"/>
-        </w:rPr>
-      </w:pPr>
-    </w:p>
-    <w:p>
-      <w:pPr>
-        <w:rPr>
-          <w:rFonts w:asciiTheme="minorHAnsi" w:hAnsiTheme="minorHAnsi" w:cstheme="minorHAnsi"/>
-          <w:sz w:val="20"/>
-          <w:szCs w:val="8"/>
-        </w:rPr>
-      </w:pPr>
-      <w:r>
-        <w:rPr>
-          <w:rFonts w:asciiTheme="minorHAnsi" w:hAnsiTheme="minorHAnsi" w:cstheme="minorHAnsi"/>
-          <w:sz w:val="20"/>
-          <w:szCs w:val="8"/>
-        </w:rPr>
-        <w:t>OpenStreetMap – Nominatim API</w:t>
+        <w:t xml:space="preserve">È stato utilizzato un database </w:t>
+      </w:r>
+      <w:proofErr w:type="spellStart"/>
+      <w:r>
+        <w:rPr>
+          <w:rFonts w:asciiTheme="minorHAnsi" w:hAnsiTheme="minorHAnsi" w:cstheme="minorHAnsi"/>
+          <w:sz w:val="20"/>
+          <w:szCs w:val="8"/>
+        </w:rPr>
+        <w:t>NoSQL</w:t>
+      </w:r>
+      <w:proofErr w:type="spellEnd"/>
+      <w:r>
+        <w:rPr>
+          <w:rFonts w:asciiTheme="minorHAnsi" w:hAnsiTheme="minorHAnsi" w:cstheme="minorHAnsi"/>
+          <w:sz w:val="20"/>
+          <w:szCs w:val="8"/>
+        </w:rPr>
+        <w:t xml:space="preserve"> in cloud. La struttura a documenti ha permesso una modellazione flessibile dei dati, adattabile alle diverse esigenze dell’applicazione.</w:t>
+      </w:r>
+    </w:p>
+    <w:p>
+      <w:pPr>
+        <w:rPr>
+          <w:rFonts w:asciiTheme="minorHAnsi" w:hAnsiTheme="minorHAnsi" w:cstheme="minorHAnsi"/>
+          <w:sz w:val="20"/>
+          <w:szCs w:val="8"/>
+        </w:rPr>
+      </w:pPr>
+    </w:p>
+    <w:p>
+      <w:pPr>
+        <w:rPr>
+          <w:rFonts w:asciiTheme="minorHAnsi" w:hAnsiTheme="minorHAnsi" w:cstheme="minorHAnsi"/>
+          <w:sz w:val="20"/>
+          <w:szCs w:val="8"/>
+        </w:rPr>
+      </w:pPr>
+      <w:proofErr w:type="spellStart"/>
+      <w:r>
+        <w:rPr>
+          <w:rFonts w:asciiTheme="minorHAnsi" w:hAnsiTheme="minorHAnsi" w:cstheme="minorHAnsi"/>
+          <w:sz w:val="20"/>
+          <w:szCs w:val="8"/>
+        </w:rPr>
+        <w:t>OpenStreetMap</w:t>
+      </w:r>
+      <w:proofErr w:type="spellEnd"/>
+      <w:r>
+        <w:rPr>
+          <w:rFonts w:asciiTheme="minorHAnsi" w:hAnsiTheme="minorHAnsi" w:cstheme="minorHAnsi"/>
+          <w:sz w:val="20"/>
+          <w:szCs w:val="8"/>
+        </w:rPr>
+        <w:t xml:space="preserve"> – </w:t>
+      </w:r>
+      <w:proofErr w:type="spellStart"/>
+      <w:r>
+        <w:rPr>
+          <w:rFonts w:asciiTheme="minorHAnsi" w:hAnsiTheme="minorHAnsi" w:cstheme="minorHAnsi"/>
+          <w:sz w:val="20"/>
+          <w:szCs w:val="8"/>
+        </w:rPr>
+        <w:t>Nominatim</w:t>
+      </w:r>
+      <w:proofErr w:type="spellEnd"/>
+      <w:r>
+        <w:rPr>
+          <w:rFonts w:asciiTheme="minorHAnsi" w:hAnsiTheme="minorHAnsi" w:cstheme="minorHAnsi"/>
+          <w:sz w:val="20"/>
+          <w:szCs w:val="8"/>
+        </w:rPr>
+        <w:t xml:space="preserve"> API</w:t>
       </w:r>
       <w:r>
         <w:rPr>
@@ -1006,6 +1262,7 @@
           <w:szCs w:val="8"/>
         </w:rPr>
       </w:pPr>
+      <w:proofErr w:type="spellStart"/>
       <w:r>
         <w:rPr>
           <w:rFonts w:asciiTheme="minorHAnsi" w:hAnsiTheme="minorHAnsi" w:cstheme="minorHAnsi"/>
@@ -1016,6 +1273,7 @@
         </w:rPr>
         <w:t>Backend</w:t>
       </w:r>
+      <w:proofErr w:type="spellEnd"/>
       <w:r>
         <w:rPr>
           <w:rFonts w:asciiTheme="minorHAnsi" w:hAnsiTheme="minorHAnsi" w:cstheme="minorHAnsi"/>
@@ -1044,8 +1302,18 @@
           <w:sz w:val="20"/>
           <w:szCs w:val="8"/>
         </w:rPr>
-        <w:t>Connessione al database MongoDB</w:t>
-      </w:r>
+        <w:t xml:space="preserve">Connessione al database </w:t>
+      </w:r>
+      <w:proofErr w:type="spellStart"/>
+      <w:r>
+        <w:rPr>
+          <w:rFonts w:asciiTheme="minorHAnsi" w:hAnsiTheme="minorHAnsi" w:cstheme="minorHAnsi"/>
+          <w:sz w:val="20"/>
+          <w:szCs w:val="8"/>
+        </w:rPr>
+        <w:t>MongoDB</w:t>
+      </w:r>
+      <w:proofErr w:type="spellEnd"/>
     </w:p>
     <w:p>
       <w:pPr>
@@ -1148,6 +1416,7 @@
           <w:szCs w:val="8"/>
         </w:rPr>
       </w:pPr>
+      <w:proofErr w:type="spellStart"/>
       <w:r>
         <w:rPr>
           <w:rFonts w:asciiTheme="minorHAnsi" w:hAnsiTheme="minorHAnsi" w:cstheme="minorHAnsi"/>
@@ -1158,6 +1427,7 @@
         </w:rPr>
         <w:t>Frontend</w:t>
       </w:r>
+      <w:proofErr w:type="spellEnd"/>
       <w:r>
         <w:rPr>
           <w:rFonts w:asciiTheme="minorHAnsi" w:hAnsiTheme="minorHAnsi" w:cstheme="minorHAnsi"/>
@@ -1215,7 +1485,25 @@
           <w:sz w:val="20"/>
           <w:szCs w:val="8"/>
         </w:rPr>
-        <w:t>navbar.js inserisce dinamicamente la barra di navigazione in base al tipo di utente loggato, verificando i dati salvati nel localStorage.</w:t>
+        <w:t xml:space="preserve">navbar.js inserisce dinamicamente la barra di navigazione in base al tipo di utente loggato, verificando i dati salvati nel </w:t>
+      </w:r>
+      <w:proofErr w:type="spellStart"/>
+      <w:r>
+        <w:rPr>
+          <w:rFonts w:asciiTheme="minorHAnsi" w:hAnsiTheme="minorHAnsi" w:cstheme="minorHAnsi"/>
+          <w:sz w:val="20"/>
+          <w:szCs w:val="8"/>
+        </w:rPr>
+        <w:t>localStorage</w:t>
+      </w:r>
+      <w:proofErr w:type="spellEnd"/>
+      <w:r>
+        <w:rPr>
+          <w:rFonts w:asciiTheme="minorHAnsi" w:hAnsiTheme="minorHAnsi" w:cstheme="minorHAnsi"/>
+          <w:sz w:val="20"/>
+          <w:szCs w:val="8"/>
+        </w:rPr>
+        <w:t>.</w:t>
       </w:r>
       <w:r>
         <w:rPr>
@@ -1439,7 +1727,25 @@
           <w:sz w:val="20"/>
           <w:szCs w:val="8"/>
         </w:rPr>
-        <w:t>’autenticazione persistente è gestita tramite localStorage, dove vengono salvati ID utente e tipo di profilo.</w:t>
+        <w:t xml:space="preserve">’autenticazione persistente è gestita tramite </w:t>
+      </w:r>
+      <w:proofErr w:type="spellStart"/>
+      <w:r>
+        <w:rPr>
+          <w:rFonts w:asciiTheme="minorHAnsi" w:hAnsiTheme="minorHAnsi" w:cstheme="minorHAnsi"/>
+          <w:sz w:val="20"/>
+          <w:szCs w:val="8"/>
+        </w:rPr>
+        <w:t>localStorage</w:t>
+      </w:r>
+      <w:proofErr w:type="spellEnd"/>
+      <w:r>
+        <w:rPr>
+          <w:rFonts w:asciiTheme="minorHAnsi" w:hAnsiTheme="minorHAnsi" w:cstheme="minorHAnsi"/>
+          <w:sz w:val="20"/>
+          <w:szCs w:val="8"/>
+        </w:rPr>
+        <w:t>, dove vengono salvati ID utente e tipo di profilo.</w:t>
       </w:r>
     </w:p>
     <w:p>
@@ -1539,7 +1845,43 @@
           <w:szCs w:val="8"/>
         </w:rPr>
         <w:br/>
-        <w:t>Permette di filtrare per nome del piatto, ingredienti o città. Il backend utilizza espressioni regolari (Regex) per consentire ricerche parziali e flessibili.</w:t>
+        <w:t xml:space="preserve">Permette di filtrare per nome del piatto, ingredienti o città. Il </w:t>
+      </w:r>
+      <w:proofErr w:type="spellStart"/>
+      <w:r>
+        <w:rPr>
+          <w:rFonts w:asciiTheme="minorHAnsi" w:hAnsiTheme="minorHAnsi" w:cstheme="minorHAnsi"/>
+          <w:sz w:val="20"/>
+          <w:szCs w:val="8"/>
+        </w:rPr>
+        <w:t>backend</w:t>
+      </w:r>
+      <w:proofErr w:type="spellEnd"/>
+      <w:r>
+        <w:rPr>
+          <w:rFonts w:asciiTheme="minorHAnsi" w:hAnsiTheme="minorHAnsi" w:cstheme="minorHAnsi"/>
+          <w:sz w:val="20"/>
+          <w:szCs w:val="8"/>
+        </w:rPr>
+        <w:t xml:space="preserve"> utilizza espressioni regolari (</w:t>
+      </w:r>
+      <w:proofErr w:type="spellStart"/>
+      <w:r>
+        <w:rPr>
+          <w:rFonts w:asciiTheme="minorHAnsi" w:hAnsiTheme="minorHAnsi" w:cstheme="minorHAnsi"/>
+          <w:sz w:val="20"/>
+          <w:szCs w:val="8"/>
+        </w:rPr>
+        <w:t>Regex</w:t>
+      </w:r>
+      <w:proofErr w:type="spellEnd"/>
+      <w:r>
+        <w:rPr>
+          <w:rFonts w:asciiTheme="minorHAnsi" w:hAnsiTheme="minorHAnsi" w:cstheme="minorHAnsi"/>
+          <w:sz w:val="20"/>
+          <w:szCs w:val="8"/>
+        </w:rPr>
+        <w:t>) per consentire ricerche parziali e flessibili.</w:t>
       </w:r>
     </w:p>
     <w:p>
@@ -1574,7 +1916,25 @@
           <w:szCs w:val="8"/>
         </w:rPr>
         <w:br/>
-        <w:t>Il carrello viene salvato nel localStorage per garantire la persistenza anche in caso di ricaricamento della pagina.</w:t>
+        <w:t xml:space="preserve">Il carrello viene salvato nel </w:t>
+      </w:r>
+      <w:proofErr w:type="spellStart"/>
+      <w:r>
+        <w:rPr>
+          <w:rFonts w:asciiTheme="minorHAnsi" w:hAnsiTheme="minorHAnsi" w:cstheme="minorHAnsi"/>
+          <w:sz w:val="20"/>
+          <w:szCs w:val="8"/>
+        </w:rPr>
+        <w:t>localStorage</w:t>
+      </w:r>
+      <w:proofErr w:type="spellEnd"/>
+      <w:r>
+        <w:rPr>
+          <w:rFonts w:asciiTheme="minorHAnsi" w:hAnsiTheme="minorHAnsi" w:cstheme="minorHAnsi"/>
+          <w:sz w:val="20"/>
+          <w:szCs w:val="8"/>
+        </w:rPr>
+        <w:t xml:space="preserve"> per garantire la persistenza anche in caso di ricaricamento della pagina.</w:t>
       </w:r>
       <w:r>
         <w:rPr>
@@ -1946,7 +2306,25 @@
           <w:sz w:val="20"/>
           <w:szCs w:val="8"/>
         </w:rPr>
-        <w:t>Applica la formula matematica di Haversine per calcolare la distanza in chilometri.</w:t>
+        <w:t xml:space="preserve">Applica la formula matematica di </w:t>
+      </w:r>
+      <w:proofErr w:type="spellStart"/>
+      <w:r>
+        <w:rPr>
+          <w:rFonts w:asciiTheme="minorHAnsi" w:hAnsiTheme="minorHAnsi" w:cstheme="minorHAnsi"/>
+          <w:sz w:val="20"/>
+          <w:szCs w:val="8"/>
+        </w:rPr>
+        <w:t>Haversine</w:t>
+      </w:r>
+      <w:proofErr w:type="spellEnd"/>
+      <w:r>
+        <w:rPr>
+          <w:rFonts w:asciiTheme="minorHAnsi" w:hAnsiTheme="minorHAnsi" w:cstheme="minorHAnsi"/>
+          <w:sz w:val="20"/>
+          <w:szCs w:val="8"/>
+        </w:rPr>
+        <w:t xml:space="preserve"> per calcolare la distanza in chilometri.</w:t>
       </w:r>
     </w:p>
     <w:p>
@@ -2017,6 +2395,7 @@
           <w:szCs w:val="8"/>
         </w:rPr>
       </w:pPr>
+      <w:proofErr w:type="spellStart"/>
       <w:r>
         <w:rPr>
           <w:rFonts w:asciiTheme="minorHAnsi" w:hAnsiTheme="minorHAnsi" w:cstheme="minorHAnsi"/>
@@ -2025,6 +2404,7 @@
         </w:rPr>
         <w:t>orarioInizio</w:t>
       </w:r>
+      <w:proofErr w:type="spellEnd"/>
     </w:p>
     <w:p>
       <w:pPr>
@@ -2038,6 +2418,7 @@
           <w:szCs w:val="8"/>
         </w:rPr>
       </w:pPr>
+      <w:proofErr w:type="spellStart"/>
       <w:r>
         <w:rPr>
           <w:rFonts w:asciiTheme="minorHAnsi" w:hAnsiTheme="minorHAnsi" w:cstheme="minorHAnsi"/>
@@ -2046,6 +2427,7 @@
         </w:rPr>
         <w:t>orarioFine</w:t>
       </w:r>
+      <w:proofErr w:type="spellEnd"/>
     </w:p>
     <w:p>
       <w:pPr>
@@ -2070,7 +2452,25 @@
           <w:szCs w:val="8"/>
         </w:rPr>
         <w:br/>
-        <w:t>Il frontend confronta l’orario attuale con questi valori per determinare se l’ordine è:</w:t>
+        <w:t xml:space="preserve">Il </w:t>
+      </w:r>
+      <w:proofErr w:type="spellStart"/>
+      <w:r>
+        <w:rPr>
+          <w:rFonts w:asciiTheme="minorHAnsi" w:hAnsiTheme="minorHAnsi" w:cstheme="minorHAnsi"/>
+          <w:sz w:val="20"/>
+          <w:szCs w:val="8"/>
+        </w:rPr>
+        <w:t>frontend</w:t>
+      </w:r>
+      <w:proofErr w:type="spellEnd"/>
+      <w:r>
+        <w:rPr>
+          <w:rFonts w:asciiTheme="minorHAnsi" w:hAnsiTheme="minorHAnsi" w:cstheme="minorHAnsi"/>
+          <w:sz w:val="20"/>
+          <w:szCs w:val="8"/>
+        </w:rPr>
+        <w:t xml:space="preserve"> confronta l’orario attuale con questi valori per determinare se l’ordine è:</w:t>
       </w:r>
     </w:p>
     <w:p>
@@ -2169,7 +2569,25 @@
           <w:szCs w:val="8"/>
         </w:rPr>
         <w:br/>
-        <w:t>All’avvio del server, se la collezione catalog è vuota, viene automaticamente popolata tramite il file meals1.json.</w:t>
+        <w:t xml:space="preserve">All’avvio del server, se la collezione </w:t>
+      </w:r>
+      <w:proofErr w:type="spellStart"/>
+      <w:r>
+        <w:rPr>
+          <w:rFonts w:asciiTheme="minorHAnsi" w:hAnsiTheme="minorHAnsi" w:cstheme="minorHAnsi"/>
+          <w:sz w:val="20"/>
+          <w:szCs w:val="8"/>
+        </w:rPr>
+        <w:t>catalog</w:t>
+      </w:r>
+      <w:proofErr w:type="spellEnd"/>
+      <w:r>
+        <w:rPr>
+          <w:rFonts w:asciiTheme="minorHAnsi" w:hAnsiTheme="minorHAnsi" w:cstheme="minorHAnsi"/>
+          <w:sz w:val="20"/>
+          <w:szCs w:val="8"/>
+        </w:rPr>
+        <w:t xml:space="preserve"> è vuota, viene automaticamente popolata tramite il file meals1.json.</w:t>
       </w:r>
     </w:p>
     <w:p>
@@ -2347,6 +2765,7 @@
         </w:rPr>
         <w:t xml:space="preserve">  "_id": </w:t>
       </w:r>
+      <w:proofErr w:type="spellStart"/>
       <w:proofErr w:type="gramStart"/>
       <w:r>
         <w:rPr>
@@ -2354,7 +2773,16 @@
           <w:sz w:val="20"/>
           <w:szCs w:val="8"/>
         </w:rPr>
-        <w:t>ObjectId(</w:t>
+        <w:t>ObjectId</w:t>
+      </w:r>
+      <w:proofErr w:type="spellEnd"/>
+      <w:r>
+        <w:rPr>
+          <w:rFonts w:asciiTheme="minorHAnsi" w:hAnsiTheme="minorHAnsi" w:cstheme="minorHAnsi"/>
+          <w:sz w:val="20"/>
+          <w:szCs w:val="8"/>
+        </w:rPr>
+        <w:t>(</w:t>
       </w:r>
       <w:proofErr w:type="gramEnd"/>
       <w:r>
@@ -2465,24 +2893,78 @@
           <w:sz w:val="20"/>
           <w:szCs w:val="8"/>
         </w:rPr>
-        <w:t xml:space="preserve">  "metodoPagamento": "carta_credito",</w:t>
-      </w:r>
-    </w:p>
-    <w:p>
-      <w:pPr>
-        <w:rPr>
-          <w:rFonts w:asciiTheme="minorHAnsi" w:hAnsiTheme="minorHAnsi" w:cstheme="minorHAnsi"/>
-          <w:sz w:val="20"/>
-          <w:szCs w:val="8"/>
-        </w:rPr>
-      </w:pPr>
-      <w:r>
-        <w:rPr>
-          <w:rFonts w:asciiTheme="minorHAnsi" w:hAnsiTheme="minorHAnsi" w:cstheme="minorHAnsi"/>
-          <w:sz w:val="20"/>
-          <w:szCs w:val="8"/>
-        </w:rPr>
-        <w:t xml:space="preserve">  "datiCarta": </w:t>
+        <w:t xml:space="preserve">  "</w:t>
+      </w:r>
+      <w:proofErr w:type="spellStart"/>
+      <w:r>
+        <w:rPr>
+          <w:rFonts w:asciiTheme="minorHAnsi" w:hAnsiTheme="minorHAnsi" w:cstheme="minorHAnsi"/>
+          <w:sz w:val="20"/>
+          <w:szCs w:val="8"/>
+        </w:rPr>
+        <w:t>metodoPagamento</w:t>
+      </w:r>
+      <w:proofErr w:type="spellEnd"/>
+      <w:r>
+        <w:rPr>
+          <w:rFonts w:asciiTheme="minorHAnsi" w:hAnsiTheme="minorHAnsi" w:cstheme="minorHAnsi"/>
+          <w:sz w:val="20"/>
+          <w:szCs w:val="8"/>
+        </w:rPr>
+        <w:t>": "</w:t>
+      </w:r>
+      <w:proofErr w:type="spellStart"/>
+      <w:r>
+        <w:rPr>
+          <w:rFonts w:asciiTheme="minorHAnsi" w:hAnsiTheme="minorHAnsi" w:cstheme="minorHAnsi"/>
+          <w:sz w:val="20"/>
+          <w:szCs w:val="8"/>
+        </w:rPr>
+        <w:t>carta_credito</w:t>
+      </w:r>
+      <w:proofErr w:type="spellEnd"/>
+      <w:r>
+        <w:rPr>
+          <w:rFonts w:asciiTheme="minorHAnsi" w:hAnsiTheme="minorHAnsi" w:cstheme="minorHAnsi"/>
+          <w:sz w:val="20"/>
+          <w:szCs w:val="8"/>
+        </w:rPr>
+        <w:t>",</w:t>
+      </w:r>
+    </w:p>
+    <w:p>
+      <w:pPr>
+        <w:rPr>
+          <w:rFonts w:asciiTheme="minorHAnsi" w:hAnsiTheme="minorHAnsi" w:cstheme="minorHAnsi"/>
+          <w:sz w:val="20"/>
+          <w:szCs w:val="8"/>
+        </w:rPr>
+      </w:pPr>
+      <w:r>
+        <w:rPr>
+          <w:rFonts w:asciiTheme="minorHAnsi" w:hAnsiTheme="minorHAnsi" w:cstheme="minorHAnsi"/>
+          <w:sz w:val="20"/>
+          <w:szCs w:val="8"/>
+        </w:rPr>
+        <w:t xml:space="preserve">  "</w:t>
+      </w:r>
+      <w:proofErr w:type="spellStart"/>
+      <w:r>
+        <w:rPr>
+          <w:rFonts w:asciiTheme="minorHAnsi" w:hAnsiTheme="minorHAnsi" w:cstheme="minorHAnsi"/>
+          <w:sz w:val="20"/>
+          <w:szCs w:val="8"/>
+        </w:rPr>
+        <w:t>datiCarta</w:t>
+      </w:r>
+      <w:proofErr w:type="spellEnd"/>
+      <w:r>
+        <w:rPr>
+          <w:rFonts w:asciiTheme="minorHAnsi" w:hAnsiTheme="minorHAnsi" w:cstheme="minorHAnsi"/>
+          <w:sz w:val="20"/>
+          <w:szCs w:val="8"/>
+        </w:rPr>
+        <w:t xml:space="preserve">": </w:t>
       </w:r>
       <w:proofErr w:type="gramStart"/>
       <w:r>
@@ -2500,7 +2982,25 @@
           <w:sz w:val="20"/>
           <w:szCs w:val="8"/>
         </w:rPr>
-        <w:t xml:space="preserve">numero": "...", "cvv": </w:t>
+        <w:t>numero": "...", "</w:t>
+      </w:r>
+      <w:proofErr w:type="spellStart"/>
+      <w:r>
+        <w:rPr>
+          <w:rFonts w:asciiTheme="minorHAnsi" w:hAnsiTheme="minorHAnsi" w:cstheme="minorHAnsi"/>
+          <w:sz w:val="20"/>
+          <w:szCs w:val="8"/>
+        </w:rPr>
+        <w:t>cvv</w:t>
+      </w:r>
+      <w:proofErr w:type="spellEnd"/>
+      <w:r>
+        <w:rPr>
+          <w:rFonts w:asciiTheme="minorHAnsi" w:hAnsiTheme="minorHAnsi" w:cstheme="minorHAnsi"/>
+          <w:sz w:val="20"/>
+          <w:szCs w:val="8"/>
+        </w:rPr>
+        <w:t xml:space="preserve">": </w:t>
       </w:r>
       <w:proofErr w:type="gramStart"/>
       <w:r>
@@ -2535,8 +3035,27 @@
           <w:sz w:val="20"/>
           <w:szCs w:val="8"/>
         </w:rPr>
-        <w:t xml:space="preserve">  "createdAt": </w:t>
-      </w:r>
+        <w:t xml:space="preserve">  "</w:t>
+      </w:r>
+      <w:proofErr w:type="spellStart"/>
+      <w:r>
+        <w:rPr>
+          <w:rFonts w:asciiTheme="minorHAnsi" w:hAnsiTheme="minorHAnsi" w:cstheme="minorHAnsi"/>
+          <w:sz w:val="20"/>
+          <w:szCs w:val="8"/>
+        </w:rPr>
+        <w:t>createdAt</w:t>
+      </w:r>
+      <w:proofErr w:type="spellEnd"/>
+      <w:r>
+        <w:rPr>
+          <w:rFonts w:asciiTheme="minorHAnsi" w:hAnsiTheme="minorHAnsi" w:cstheme="minorHAnsi"/>
+          <w:sz w:val="20"/>
+          <w:szCs w:val="8"/>
+        </w:rPr>
+        <w:t xml:space="preserve">": </w:t>
+      </w:r>
+      <w:proofErr w:type="spellStart"/>
       <w:proofErr w:type="gramStart"/>
       <w:r>
         <w:rPr>
@@ -2544,7 +3063,16 @@
           <w:sz w:val="20"/>
           <w:szCs w:val="8"/>
         </w:rPr>
-        <w:t>ISODate(</w:t>
+        <w:t>ISODate</w:t>
+      </w:r>
+      <w:proofErr w:type="spellEnd"/>
+      <w:r>
+        <w:rPr>
+          <w:rFonts w:asciiTheme="minorHAnsi" w:hAnsiTheme="minorHAnsi" w:cstheme="minorHAnsi"/>
+          <w:sz w:val="20"/>
+          <w:szCs w:val="8"/>
+        </w:rPr>
+        <w:t>(</w:t>
       </w:r>
       <w:proofErr w:type="gramEnd"/>
       <w:r>
@@ -2593,13 +3121,6 @@
     </w:p>
     <w:p>
       <w:pPr>
-        <w:rPr>
-          <w:rFonts w:asciiTheme="minorHAnsi" w:hAnsiTheme="minorHAnsi" w:cstheme="minorHAnsi"/>
-          <w:sz w:val="20"/>
-          <w:szCs w:val="8"/>
-        </w:rPr>
-      </w:pPr>
-      <w:r>
         <w:rPr>
           <w:rFonts w:asciiTheme="minorHAnsi" w:hAnsiTheme="minorHAnsi" w:cstheme="minorHAnsi"/>
           <w:b/>
@@ -2607,6 +3128,36 @@
           <w:sz w:val="20"/>
           <w:szCs w:val="8"/>
         </w:rPr>
+      </w:pPr>
+    </w:p>
+    <w:p>
+      <w:pPr>
+        <w:rPr>
+          <w:rFonts w:asciiTheme="minorHAnsi" w:hAnsiTheme="minorHAnsi" w:cstheme="minorHAnsi"/>
+          <w:b/>
+          <w:bCs/>
+          <w:sz w:val="20"/>
+          <w:szCs w:val="8"/>
+        </w:rPr>
+      </w:pPr>
+    </w:p>
+    <w:p>
+      <w:pPr>
+        <w:rPr>
+          <w:rFonts w:asciiTheme="minorHAnsi" w:hAnsiTheme="minorHAnsi" w:cstheme="minorHAnsi"/>
+          <w:sz w:val="20"/>
+          <w:szCs w:val="8"/>
+        </w:rPr>
+      </w:pPr>
+      <w:r>
+        <w:rPr>
+          <w:rFonts w:asciiTheme="minorHAnsi" w:hAnsiTheme="minorHAnsi" w:cstheme="minorHAnsi"/>
+          <w:b/>
+          <w:bCs/>
+          <w:sz w:val="20"/>
+          <w:szCs w:val="8"/>
+        </w:rPr>
+        <w:lastRenderedPageBreak/>
         <w:t>Ristoratori</w:t>
       </w:r>
       <w:r>
@@ -2642,7 +3193,6 @@
           <w:sz w:val="20"/>
           <w:szCs w:val="8"/>
         </w:rPr>
-        <w:lastRenderedPageBreak/>
         <w:t>JSON</w:t>
       </w:r>
     </w:p>
@@ -2679,6 +3229,7 @@
         </w:rPr>
         <w:t xml:space="preserve">  "_id": </w:t>
       </w:r>
+      <w:proofErr w:type="spellStart"/>
       <w:proofErr w:type="gramStart"/>
       <w:r>
         <w:rPr>
@@ -2686,7 +3237,16 @@
           <w:sz w:val="20"/>
           <w:szCs w:val="8"/>
         </w:rPr>
-        <w:t>ObjectId(</w:t>
+        <w:t>ObjectId</w:t>
+      </w:r>
+      <w:proofErr w:type="spellEnd"/>
+      <w:r>
+        <w:rPr>
+          <w:rFonts w:asciiTheme="minorHAnsi" w:hAnsiTheme="minorHAnsi" w:cstheme="minorHAnsi"/>
+          <w:sz w:val="20"/>
+          <w:szCs w:val="8"/>
+        </w:rPr>
+        <w:t>(</w:t>
       </w:r>
       <w:proofErr w:type="gramEnd"/>
       <w:r>
@@ -2712,7 +3272,25 @@
           <w:sz w:val="20"/>
           <w:szCs w:val="8"/>
         </w:rPr>
-        <w:t xml:space="preserve">  "nomeRistorante": "Pizzeria da Mario",</w:t>
+        <w:t xml:space="preserve">  "</w:t>
+      </w:r>
+      <w:proofErr w:type="spellStart"/>
+      <w:r>
+        <w:rPr>
+          <w:rFonts w:asciiTheme="minorHAnsi" w:hAnsiTheme="minorHAnsi" w:cstheme="minorHAnsi"/>
+          <w:sz w:val="20"/>
+          <w:szCs w:val="8"/>
+        </w:rPr>
+        <w:t>nomeRistorante</w:t>
+      </w:r>
+      <w:proofErr w:type="spellEnd"/>
+      <w:r>
+        <w:rPr>
+          <w:rFonts w:asciiTheme="minorHAnsi" w:hAnsiTheme="minorHAnsi" w:cstheme="minorHAnsi"/>
+          <w:sz w:val="20"/>
+          <w:szCs w:val="8"/>
+        </w:rPr>
+        <w:t>": "Pizzeria da Mario",</w:t>
       </w:r>
     </w:p>
     <w:p>
@@ -2780,24 +3358,60 @@
           <w:sz w:val="20"/>
           <w:szCs w:val="8"/>
         </w:rPr>
-        <w:t xml:space="preserve">  "lat": 45.4642,</w:t>
-      </w:r>
-    </w:p>
-    <w:p>
-      <w:pPr>
-        <w:rPr>
-          <w:rFonts w:asciiTheme="minorHAnsi" w:hAnsiTheme="minorHAnsi" w:cstheme="minorHAnsi"/>
-          <w:sz w:val="20"/>
-          <w:szCs w:val="8"/>
-        </w:rPr>
-      </w:pPr>
-      <w:r>
-        <w:rPr>
-          <w:rFonts w:asciiTheme="minorHAnsi" w:hAnsiTheme="minorHAnsi" w:cstheme="minorHAnsi"/>
-          <w:sz w:val="20"/>
-          <w:szCs w:val="8"/>
-        </w:rPr>
-        <w:t xml:space="preserve">  "lon": 9.1900,</w:t>
+        <w:t xml:space="preserve">  "</w:t>
+      </w:r>
+      <w:proofErr w:type="spellStart"/>
+      <w:r>
+        <w:rPr>
+          <w:rFonts w:asciiTheme="minorHAnsi" w:hAnsiTheme="minorHAnsi" w:cstheme="minorHAnsi"/>
+          <w:sz w:val="20"/>
+          <w:szCs w:val="8"/>
+        </w:rPr>
+        <w:t>lat</w:t>
+      </w:r>
+      <w:proofErr w:type="spellEnd"/>
+      <w:r>
+        <w:rPr>
+          <w:rFonts w:asciiTheme="minorHAnsi" w:hAnsiTheme="minorHAnsi" w:cstheme="minorHAnsi"/>
+          <w:sz w:val="20"/>
+          <w:szCs w:val="8"/>
+        </w:rPr>
+        <w:t>": 45.4642,</w:t>
+      </w:r>
+    </w:p>
+    <w:p>
+      <w:pPr>
+        <w:rPr>
+          <w:rFonts w:asciiTheme="minorHAnsi" w:hAnsiTheme="minorHAnsi" w:cstheme="minorHAnsi"/>
+          <w:sz w:val="20"/>
+          <w:szCs w:val="8"/>
+        </w:rPr>
+      </w:pPr>
+      <w:r>
+        <w:rPr>
+          <w:rFonts w:asciiTheme="minorHAnsi" w:hAnsiTheme="minorHAnsi" w:cstheme="minorHAnsi"/>
+          <w:sz w:val="20"/>
+          <w:szCs w:val="8"/>
+        </w:rPr>
+        <w:t xml:space="preserve">  "</w:t>
+      </w:r>
+      <w:proofErr w:type="spellStart"/>
+      <w:r>
+        <w:rPr>
+          <w:rFonts w:asciiTheme="minorHAnsi" w:hAnsiTheme="minorHAnsi" w:cstheme="minorHAnsi"/>
+          <w:sz w:val="20"/>
+          <w:szCs w:val="8"/>
+        </w:rPr>
+        <w:t>lon</w:t>
+      </w:r>
+      <w:proofErr w:type="spellEnd"/>
+      <w:r>
+        <w:rPr>
+          <w:rFonts w:asciiTheme="minorHAnsi" w:hAnsiTheme="minorHAnsi" w:cstheme="minorHAnsi"/>
+          <w:sz w:val="20"/>
+          <w:szCs w:val="8"/>
+        </w:rPr>
+        <w:t>": 9.1900,</w:t>
       </w:r>
     </w:p>
     <w:p>
@@ -2832,7 +3446,25 @@
           <w:sz w:val="20"/>
           <w:szCs w:val="8"/>
         </w:rPr>
-        <w:t xml:space="preserve"> ] // Array di sottodocumenti per ridondanza/efficienza</w:t>
+        <w:t xml:space="preserve"> ] // Array di </w:t>
+      </w:r>
+      <w:proofErr w:type="spellStart"/>
+      <w:r>
+        <w:rPr>
+          <w:rFonts w:asciiTheme="minorHAnsi" w:hAnsiTheme="minorHAnsi" w:cstheme="minorHAnsi"/>
+          <w:sz w:val="20"/>
+          <w:szCs w:val="8"/>
+        </w:rPr>
+        <w:t>sottodocumenti</w:t>
+      </w:r>
+      <w:proofErr w:type="spellEnd"/>
+      <w:r>
+        <w:rPr>
+          <w:rFonts w:asciiTheme="minorHAnsi" w:hAnsiTheme="minorHAnsi" w:cstheme="minorHAnsi"/>
+          <w:sz w:val="20"/>
+          <w:szCs w:val="8"/>
+        </w:rPr>
+        <w:t xml:space="preserve"> per ridondanza/efficienza</w:t>
       </w:r>
     </w:p>
     <w:p>
@@ -2851,42 +3483,6 @@
         </w:rPr>
         <w:t>}</w:t>
       </w:r>
-    </w:p>
-    <w:p>
-      <w:pPr>
-        <w:rPr>
-          <w:rFonts w:asciiTheme="minorHAnsi" w:hAnsiTheme="minorHAnsi" w:cstheme="minorHAnsi"/>
-          <w:sz w:val="20"/>
-          <w:szCs w:val="8"/>
-        </w:rPr>
-      </w:pPr>
-    </w:p>
-    <w:p>
-      <w:pPr>
-        <w:rPr>
-          <w:rFonts w:asciiTheme="minorHAnsi" w:hAnsiTheme="minorHAnsi" w:cstheme="minorHAnsi"/>
-          <w:sz w:val="20"/>
-          <w:szCs w:val="8"/>
-        </w:rPr>
-      </w:pPr>
-    </w:p>
-    <w:p>
-      <w:pPr>
-        <w:rPr>
-          <w:rFonts w:asciiTheme="minorHAnsi" w:hAnsiTheme="minorHAnsi" w:cstheme="minorHAnsi"/>
-          <w:sz w:val="20"/>
-          <w:szCs w:val="8"/>
-        </w:rPr>
-      </w:pPr>
-    </w:p>
-    <w:p>
-      <w:pPr>
-        <w:rPr>
-          <w:rFonts w:asciiTheme="minorHAnsi" w:hAnsiTheme="minorHAnsi" w:cstheme="minorHAnsi"/>
-          <w:sz w:val="20"/>
-          <w:szCs w:val="8"/>
-        </w:rPr>
-      </w:pPr>
     </w:p>
     <w:p>
       <w:pPr>
@@ -2931,7 +3527,25 @@
           <w:szCs w:val="8"/>
         </w:rPr>
         <w:br/>
-        <w:t>Collegati ai ristoratori tramite ristoranteId.</w:t>
+        <w:t xml:space="preserve">Collegati ai ristoratori tramite </w:t>
+      </w:r>
+      <w:proofErr w:type="spellStart"/>
+      <w:r>
+        <w:rPr>
+          <w:rFonts w:asciiTheme="minorHAnsi" w:hAnsiTheme="minorHAnsi" w:cstheme="minorHAnsi"/>
+          <w:sz w:val="20"/>
+          <w:szCs w:val="8"/>
+        </w:rPr>
+        <w:t>ristoranteId</w:t>
+      </w:r>
+      <w:proofErr w:type="spellEnd"/>
+      <w:r>
+        <w:rPr>
+          <w:rFonts w:asciiTheme="minorHAnsi" w:hAnsiTheme="minorHAnsi" w:cstheme="minorHAnsi"/>
+          <w:sz w:val="20"/>
+          <w:szCs w:val="8"/>
+        </w:rPr>
+        <w:t>.</w:t>
       </w:r>
     </w:p>
     <w:p>
@@ -2976,6 +3590,7 @@
         </w:rPr>
         <w:t xml:space="preserve">  "_id": </w:t>
       </w:r>
+      <w:proofErr w:type="spellStart"/>
       <w:proofErr w:type="gramStart"/>
       <w:r>
         <w:rPr>
@@ -2983,7 +3598,16 @@
           <w:sz w:val="20"/>
           <w:szCs w:val="8"/>
         </w:rPr>
-        <w:t>ObjectId(</w:t>
+        <w:t>ObjectId</w:t>
+      </w:r>
+      <w:proofErr w:type="spellEnd"/>
+      <w:r>
+        <w:rPr>
+          <w:rFonts w:asciiTheme="minorHAnsi" w:hAnsiTheme="minorHAnsi" w:cstheme="minorHAnsi"/>
+          <w:sz w:val="20"/>
+          <w:szCs w:val="8"/>
+        </w:rPr>
+        <w:t>(</w:t>
       </w:r>
       <w:proofErr w:type="gramEnd"/>
       <w:r>
@@ -3112,8 +3736,27 @@
           <w:sz w:val="20"/>
           <w:szCs w:val="8"/>
         </w:rPr>
-        <w:t xml:space="preserve">  "ristoranteId": </w:t>
-      </w:r>
+        <w:t xml:space="preserve">  "</w:t>
+      </w:r>
+      <w:proofErr w:type="spellStart"/>
+      <w:r>
+        <w:rPr>
+          <w:rFonts w:asciiTheme="minorHAnsi" w:hAnsiTheme="minorHAnsi" w:cstheme="minorHAnsi"/>
+          <w:sz w:val="20"/>
+          <w:szCs w:val="8"/>
+        </w:rPr>
+        <w:t>ristoranteId</w:t>
+      </w:r>
+      <w:proofErr w:type="spellEnd"/>
+      <w:r>
+        <w:rPr>
+          <w:rFonts w:asciiTheme="minorHAnsi" w:hAnsiTheme="minorHAnsi" w:cstheme="minorHAnsi"/>
+          <w:sz w:val="20"/>
+          <w:szCs w:val="8"/>
+        </w:rPr>
+        <w:t xml:space="preserve">": </w:t>
+      </w:r>
+      <w:proofErr w:type="spellStart"/>
       <w:proofErr w:type="gramStart"/>
       <w:r>
         <w:rPr>
@@ -3121,7 +3764,16 @@
           <w:sz w:val="20"/>
           <w:szCs w:val="8"/>
         </w:rPr>
-        <w:t>ObjectId(</w:t>
+        <w:t>ObjectId</w:t>
+      </w:r>
+      <w:proofErr w:type="spellEnd"/>
+      <w:r>
+        <w:rPr>
+          <w:rFonts w:asciiTheme="minorHAnsi" w:hAnsiTheme="minorHAnsi" w:cstheme="minorHAnsi"/>
+          <w:sz w:val="20"/>
+          <w:szCs w:val="8"/>
+        </w:rPr>
+        <w:t>(</w:t>
       </w:r>
       <w:proofErr w:type="gramEnd"/>
       <w:r>
@@ -3147,24 +3799,60 @@
           <w:sz w:val="20"/>
           <w:szCs w:val="8"/>
         </w:rPr>
-        <w:t xml:space="preserve">  "ristoranteNome": "Pizzeria da Mario",</w:t>
-      </w:r>
-    </w:p>
-    <w:p>
-      <w:pPr>
-        <w:rPr>
-          <w:rFonts w:asciiTheme="minorHAnsi" w:hAnsiTheme="minorHAnsi" w:cstheme="minorHAnsi"/>
-          <w:sz w:val="20"/>
-          <w:szCs w:val="8"/>
-        </w:rPr>
-      </w:pPr>
-      <w:r>
-        <w:rPr>
-          <w:rFonts w:asciiTheme="minorHAnsi" w:hAnsiTheme="minorHAnsi" w:cstheme="minorHAnsi"/>
-          <w:sz w:val="20"/>
-          <w:szCs w:val="8"/>
-        </w:rPr>
-        <w:t xml:space="preserve">  "thumb": "https://..."</w:t>
+        <w:t xml:space="preserve">  "</w:t>
+      </w:r>
+      <w:proofErr w:type="spellStart"/>
+      <w:r>
+        <w:rPr>
+          <w:rFonts w:asciiTheme="minorHAnsi" w:hAnsiTheme="minorHAnsi" w:cstheme="minorHAnsi"/>
+          <w:sz w:val="20"/>
+          <w:szCs w:val="8"/>
+        </w:rPr>
+        <w:t>ristoranteNome</w:t>
+      </w:r>
+      <w:proofErr w:type="spellEnd"/>
+      <w:r>
+        <w:rPr>
+          <w:rFonts w:asciiTheme="minorHAnsi" w:hAnsiTheme="minorHAnsi" w:cstheme="minorHAnsi"/>
+          <w:sz w:val="20"/>
+          <w:szCs w:val="8"/>
+        </w:rPr>
+        <w:t>": "Pizzeria da Mario",</w:t>
+      </w:r>
+    </w:p>
+    <w:p>
+      <w:pPr>
+        <w:rPr>
+          <w:rFonts w:asciiTheme="minorHAnsi" w:hAnsiTheme="minorHAnsi" w:cstheme="minorHAnsi"/>
+          <w:sz w:val="20"/>
+          <w:szCs w:val="8"/>
+        </w:rPr>
+      </w:pPr>
+      <w:r>
+        <w:rPr>
+          <w:rFonts w:asciiTheme="minorHAnsi" w:hAnsiTheme="minorHAnsi" w:cstheme="minorHAnsi"/>
+          <w:sz w:val="20"/>
+          <w:szCs w:val="8"/>
+        </w:rPr>
+        <w:t xml:space="preserve">  "</w:t>
+      </w:r>
+      <w:proofErr w:type="spellStart"/>
+      <w:r>
+        <w:rPr>
+          <w:rFonts w:asciiTheme="minorHAnsi" w:hAnsiTheme="minorHAnsi" w:cstheme="minorHAnsi"/>
+          <w:sz w:val="20"/>
+          <w:szCs w:val="8"/>
+        </w:rPr>
+        <w:t>thumb</w:t>
+      </w:r>
+      <w:proofErr w:type="spellEnd"/>
+      <w:r>
+        <w:rPr>
+          <w:rFonts w:asciiTheme="minorHAnsi" w:hAnsiTheme="minorHAnsi" w:cstheme="minorHAnsi"/>
+          <w:sz w:val="20"/>
+          <w:szCs w:val="8"/>
+        </w:rPr>
+        <w:t>": "https://..."</w:t>
       </w:r>
     </w:p>
     <w:p>
@@ -3289,6 +3977,7 @@
         </w:rPr>
         <w:t xml:space="preserve">  "_id": </w:t>
       </w:r>
+      <w:proofErr w:type="spellStart"/>
       <w:proofErr w:type="gramStart"/>
       <w:r>
         <w:rPr>
@@ -3296,7 +3985,16 @@
           <w:sz w:val="20"/>
           <w:szCs w:val="8"/>
         </w:rPr>
-        <w:t>ObjectId(</w:t>
+        <w:t>ObjectId</w:t>
+      </w:r>
+      <w:proofErr w:type="spellEnd"/>
+      <w:r>
+        <w:rPr>
+          <w:rFonts w:asciiTheme="minorHAnsi" w:hAnsiTheme="minorHAnsi" w:cstheme="minorHAnsi"/>
+          <w:sz w:val="20"/>
+          <w:szCs w:val="8"/>
+        </w:rPr>
+        <w:t>(</w:t>
       </w:r>
       <w:proofErr w:type="gramEnd"/>
       <w:r>
@@ -3322,8 +4020,27 @@
           <w:sz w:val="20"/>
           <w:szCs w:val="8"/>
         </w:rPr>
-        <w:t xml:space="preserve">  "clienteId": </w:t>
-      </w:r>
+        <w:t xml:space="preserve">  "</w:t>
+      </w:r>
+      <w:proofErr w:type="spellStart"/>
+      <w:r>
+        <w:rPr>
+          <w:rFonts w:asciiTheme="minorHAnsi" w:hAnsiTheme="minorHAnsi" w:cstheme="minorHAnsi"/>
+          <w:sz w:val="20"/>
+          <w:szCs w:val="8"/>
+        </w:rPr>
+        <w:t>clienteId</w:t>
+      </w:r>
+      <w:proofErr w:type="spellEnd"/>
+      <w:r>
+        <w:rPr>
+          <w:rFonts w:asciiTheme="minorHAnsi" w:hAnsiTheme="minorHAnsi" w:cstheme="minorHAnsi"/>
+          <w:sz w:val="20"/>
+          <w:szCs w:val="8"/>
+        </w:rPr>
+        <w:t xml:space="preserve">": </w:t>
+      </w:r>
+      <w:proofErr w:type="spellStart"/>
       <w:proofErr w:type="gramStart"/>
       <w:r>
         <w:rPr>
@@ -3331,7 +4048,16 @@
           <w:sz w:val="20"/>
           <w:szCs w:val="8"/>
         </w:rPr>
-        <w:t>ObjectId(</w:t>
+        <w:t>ObjectId</w:t>
+      </w:r>
+      <w:proofErr w:type="spellEnd"/>
+      <w:r>
+        <w:rPr>
+          <w:rFonts w:asciiTheme="minorHAnsi" w:hAnsiTheme="minorHAnsi" w:cstheme="minorHAnsi"/>
+          <w:sz w:val="20"/>
+          <w:szCs w:val="8"/>
+        </w:rPr>
+        <w:t>(</w:t>
       </w:r>
       <w:proofErr w:type="gramEnd"/>
       <w:r>
@@ -3357,8 +4083,27 @@
           <w:sz w:val="20"/>
           <w:szCs w:val="8"/>
         </w:rPr>
-        <w:t xml:space="preserve">  "ristoranteId": </w:t>
-      </w:r>
+        <w:t xml:space="preserve">  "</w:t>
+      </w:r>
+      <w:proofErr w:type="spellStart"/>
+      <w:r>
+        <w:rPr>
+          <w:rFonts w:asciiTheme="minorHAnsi" w:hAnsiTheme="minorHAnsi" w:cstheme="minorHAnsi"/>
+          <w:sz w:val="20"/>
+          <w:szCs w:val="8"/>
+        </w:rPr>
+        <w:t>ristoranteId</w:t>
+      </w:r>
+      <w:proofErr w:type="spellEnd"/>
+      <w:r>
+        <w:rPr>
+          <w:rFonts w:asciiTheme="minorHAnsi" w:hAnsiTheme="minorHAnsi" w:cstheme="minorHAnsi"/>
+          <w:sz w:val="20"/>
+          <w:szCs w:val="8"/>
+        </w:rPr>
+        <w:t xml:space="preserve">": </w:t>
+      </w:r>
+      <w:proofErr w:type="spellStart"/>
       <w:proofErr w:type="gramStart"/>
       <w:r>
         <w:rPr>
@@ -3366,7 +4111,16 @@
           <w:sz w:val="20"/>
           <w:szCs w:val="8"/>
         </w:rPr>
-        <w:t>ObjectId(</w:t>
+        <w:t>ObjectId</w:t>
+      </w:r>
+      <w:proofErr w:type="spellEnd"/>
+      <w:r>
+        <w:rPr>
+          <w:rFonts w:asciiTheme="minorHAnsi" w:hAnsiTheme="minorHAnsi" w:cstheme="minorHAnsi"/>
+          <w:sz w:val="20"/>
+          <w:szCs w:val="8"/>
+        </w:rPr>
+        <w:t>(</w:t>
       </w:r>
       <w:proofErr w:type="gramEnd"/>
       <w:r>
@@ -3427,7 +4181,25 @@
           <w:sz w:val="20"/>
           <w:szCs w:val="8"/>
         </w:rPr>
-        <w:t xml:space="preserve">nome": "Pizza Margherita", "quantita": 2, "prezzo": </w:t>
+        <w:t>nome": "Pizza Margherita", "</w:t>
+      </w:r>
+      <w:proofErr w:type="spellStart"/>
+      <w:r>
+        <w:rPr>
+          <w:rFonts w:asciiTheme="minorHAnsi" w:hAnsiTheme="minorHAnsi" w:cstheme="minorHAnsi"/>
+          <w:sz w:val="20"/>
+          <w:szCs w:val="8"/>
+        </w:rPr>
+        <w:t>quantita</w:t>
+      </w:r>
+      <w:proofErr w:type="spellEnd"/>
+      <w:r>
+        <w:rPr>
+          <w:rFonts w:asciiTheme="minorHAnsi" w:hAnsiTheme="minorHAnsi" w:cstheme="minorHAnsi"/>
+          <w:sz w:val="20"/>
+          <w:szCs w:val="8"/>
+        </w:rPr>
+        <w:t xml:space="preserve">": 2, "prezzo": </w:t>
       </w:r>
       <w:proofErr w:type="gramStart"/>
       <w:r>
@@ -3488,59 +4260,132 @@
           <w:sz w:val="20"/>
           <w:szCs w:val="8"/>
         </w:rPr>
-        <w:t xml:space="preserve">  "costoConsegna": 5.00,</w:t>
-      </w:r>
-    </w:p>
-    <w:p>
-      <w:pPr>
-        <w:rPr>
-          <w:rFonts w:asciiTheme="minorHAnsi" w:hAnsiTheme="minorHAnsi" w:cstheme="minorHAnsi"/>
-          <w:sz w:val="20"/>
-          <w:szCs w:val="8"/>
-        </w:rPr>
-      </w:pPr>
-      <w:r>
-        <w:rPr>
-          <w:rFonts w:asciiTheme="minorHAnsi" w:hAnsiTheme="minorHAnsi" w:cstheme="minorHAnsi"/>
-          <w:sz w:val="20"/>
-          <w:szCs w:val="8"/>
-        </w:rPr>
-        <w:t xml:space="preserve">  "tipoConsegna": "domicilio",</w:t>
-      </w:r>
-    </w:p>
-    <w:p>
-      <w:pPr>
-        <w:rPr>
-          <w:rFonts w:asciiTheme="minorHAnsi" w:hAnsiTheme="minorHAnsi" w:cstheme="minorHAnsi"/>
-          <w:sz w:val="20"/>
-          <w:szCs w:val="8"/>
-        </w:rPr>
-      </w:pPr>
-      <w:r>
-        <w:rPr>
-          <w:rFonts w:asciiTheme="minorHAnsi" w:hAnsiTheme="minorHAnsi" w:cstheme="minorHAnsi"/>
-          <w:sz w:val="20"/>
-          <w:szCs w:val="8"/>
-        </w:rPr>
-        <w:t xml:space="preserve">  "indirizzoConsegna": "Via Po 5, Milano",</w:t>
-      </w:r>
-    </w:p>
-    <w:p>
-      <w:pPr>
-        <w:rPr>
-          <w:rFonts w:asciiTheme="minorHAnsi" w:hAnsiTheme="minorHAnsi" w:cstheme="minorHAnsi"/>
-          <w:sz w:val="20"/>
-          <w:szCs w:val="8"/>
-        </w:rPr>
-      </w:pPr>
-      <w:r>
-        <w:rPr>
-          <w:rFonts w:asciiTheme="minorHAnsi" w:hAnsiTheme="minorHAnsi" w:cstheme="minorHAnsi"/>
-          <w:sz w:val="20"/>
-          <w:szCs w:val="8"/>
-        </w:rPr>
-        <w:t xml:space="preserve">  "orarioInizio": </w:t>
-      </w:r>
+        <w:t xml:space="preserve">  "</w:t>
+      </w:r>
+      <w:proofErr w:type="spellStart"/>
+      <w:r>
+        <w:rPr>
+          <w:rFonts w:asciiTheme="minorHAnsi" w:hAnsiTheme="minorHAnsi" w:cstheme="minorHAnsi"/>
+          <w:sz w:val="20"/>
+          <w:szCs w:val="8"/>
+        </w:rPr>
+        <w:t>costoConsegna</w:t>
+      </w:r>
+      <w:proofErr w:type="spellEnd"/>
+      <w:r>
+        <w:rPr>
+          <w:rFonts w:asciiTheme="minorHAnsi" w:hAnsiTheme="minorHAnsi" w:cstheme="minorHAnsi"/>
+          <w:sz w:val="20"/>
+          <w:szCs w:val="8"/>
+        </w:rPr>
+        <w:t>": 5.00,</w:t>
+      </w:r>
+    </w:p>
+    <w:p>
+      <w:pPr>
+        <w:rPr>
+          <w:rFonts w:asciiTheme="minorHAnsi" w:hAnsiTheme="minorHAnsi" w:cstheme="minorHAnsi"/>
+          <w:sz w:val="20"/>
+          <w:szCs w:val="8"/>
+        </w:rPr>
+      </w:pPr>
+      <w:r>
+        <w:rPr>
+          <w:rFonts w:asciiTheme="minorHAnsi" w:hAnsiTheme="minorHAnsi" w:cstheme="minorHAnsi"/>
+          <w:sz w:val="20"/>
+          <w:szCs w:val="8"/>
+        </w:rPr>
+        <w:t xml:space="preserve">  "</w:t>
+      </w:r>
+      <w:proofErr w:type="spellStart"/>
+      <w:r>
+        <w:rPr>
+          <w:rFonts w:asciiTheme="minorHAnsi" w:hAnsiTheme="minorHAnsi" w:cstheme="minorHAnsi"/>
+          <w:sz w:val="20"/>
+          <w:szCs w:val="8"/>
+        </w:rPr>
+        <w:t>tipoConsegna</w:t>
+      </w:r>
+      <w:proofErr w:type="spellEnd"/>
+      <w:r>
+        <w:rPr>
+          <w:rFonts w:asciiTheme="minorHAnsi" w:hAnsiTheme="minorHAnsi" w:cstheme="minorHAnsi"/>
+          <w:sz w:val="20"/>
+          <w:szCs w:val="8"/>
+        </w:rPr>
+        <w:t>": "domicilio",</w:t>
+      </w:r>
+    </w:p>
+    <w:p>
+      <w:pPr>
+        <w:rPr>
+          <w:rFonts w:asciiTheme="minorHAnsi" w:hAnsiTheme="minorHAnsi" w:cstheme="minorHAnsi"/>
+          <w:sz w:val="20"/>
+          <w:szCs w:val="8"/>
+        </w:rPr>
+      </w:pPr>
+      <w:r>
+        <w:rPr>
+          <w:rFonts w:asciiTheme="minorHAnsi" w:hAnsiTheme="minorHAnsi" w:cstheme="minorHAnsi"/>
+          <w:sz w:val="20"/>
+          <w:szCs w:val="8"/>
+        </w:rPr>
+        <w:t xml:space="preserve">  "</w:t>
+      </w:r>
+      <w:proofErr w:type="spellStart"/>
+      <w:r>
+        <w:rPr>
+          <w:rFonts w:asciiTheme="minorHAnsi" w:hAnsiTheme="minorHAnsi" w:cstheme="minorHAnsi"/>
+          <w:sz w:val="20"/>
+          <w:szCs w:val="8"/>
+        </w:rPr>
+        <w:t>indirizzoConsegna</w:t>
+      </w:r>
+      <w:proofErr w:type="spellEnd"/>
+      <w:r>
+        <w:rPr>
+          <w:rFonts w:asciiTheme="minorHAnsi" w:hAnsiTheme="minorHAnsi" w:cstheme="minorHAnsi"/>
+          <w:sz w:val="20"/>
+          <w:szCs w:val="8"/>
+        </w:rPr>
+        <w:t>": "Via Po 5, Milano",</w:t>
+      </w:r>
+    </w:p>
+    <w:p>
+      <w:pPr>
+        <w:rPr>
+          <w:rFonts w:asciiTheme="minorHAnsi" w:hAnsiTheme="minorHAnsi" w:cstheme="minorHAnsi"/>
+          <w:sz w:val="20"/>
+          <w:szCs w:val="8"/>
+        </w:rPr>
+      </w:pPr>
+      <w:r>
+        <w:rPr>
+          <w:rFonts w:asciiTheme="minorHAnsi" w:hAnsiTheme="minorHAnsi" w:cstheme="minorHAnsi"/>
+          <w:sz w:val="20"/>
+          <w:szCs w:val="8"/>
+        </w:rPr>
+        <w:t xml:space="preserve">  "</w:t>
+      </w:r>
+      <w:proofErr w:type="spellStart"/>
+      <w:r>
+        <w:rPr>
+          <w:rFonts w:asciiTheme="minorHAnsi" w:hAnsiTheme="minorHAnsi" w:cstheme="minorHAnsi"/>
+          <w:sz w:val="20"/>
+          <w:szCs w:val="8"/>
+        </w:rPr>
+        <w:t>orarioInizio</w:t>
+      </w:r>
+      <w:proofErr w:type="spellEnd"/>
+      <w:r>
+        <w:rPr>
+          <w:rFonts w:asciiTheme="minorHAnsi" w:hAnsiTheme="minorHAnsi" w:cstheme="minorHAnsi"/>
+          <w:sz w:val="20"/>
+          <w:szCs w:val="8"/>
+        </w:rPr>
+        <w:t xml:space="preserve">": </w:t>
+      </w:r>
+      <w:proofErr w:type="spellStart"/>
       <w:proofErr w:type="gramStart"/>
       <w:r>
         <w:rPr>
@@ -3548,7 +4393,16 @@
           <w:sz w:val="20"/>
           <w:szCs w:val="8"/>
         </w:rPr>
-        <w:t>ISODate(</w:t>
+        <w:t>ISODate</w:t>
+      </w:r>
+      <w:proofErr w:type="spellEnd"/>
+      <w:r>
+        <w:rPr>
+          <w:rFonts w:asciiTheme="minorHAnsi" w:hAnsiTheme="minorHAnsi" w:cstheme="minorHAnsi"/>
+          <w:sz w:val="20"/>
+          <w:szCs w:val="8"/>
+        </w:rPr>
+        <w:t>(</w:t>
       </w:r>
       <w:proofErr w:type="gramEnd"/>
       <w:r>
@@ -3574,8 +4428,27 @@
           <w:sz w:val="20"/>
           <w:szCs w:val="8"/>
         </w:rPr>
-        <w:t xml:space="preserve">  "orarioFine": </w:t>
-      </w:r>
+        <w:t xml:space="preserve">  "</w:t>
+      </w:r>
+      <w:proofErr w:type="spellStart"/>
+      <w:r>
+        <w:rPr>
+          <w:rFonts w:asciiTheme="minorHAnsi" w:hAnsiTheme="minorHAnsi" w:cstheme="minorHAnsi"/>
+          <w:sz w:val="20"/>
+          <w:szCs w:val="8"/>
+        </w:rPr>
+        <w:t>orarioFine</w:t>
+      </w:r>
+      <w:proofErr w:type="spellEnd"/>
+      <w:r>
+        <w:rPr>
+          <w:rFonts w:asciiTheme="minorHAnsi" w:hAnsiTheme="minorHAnsi" w:cstheme="minorHAnsi"/>
+          <w:sz w:val="20"/>
+          <w:szCs w:val="8"/>
+        </w:rPr>
+        <w:t xml:space="preserve">": </w:t>
+      </w:r>
+      <w:proofErr w:type="spellStart"/>
       <w:proofErr w:type="gramStart"/>
       <w:r>
         <w:rPr>
@@ -3583,7 +4456,16 @@
           <w:sz w:val="20"/>
           <w:szCs w:val="8"/>
         </w:rPr>
-        <w:t>ISODate(</w:t>
+        <w:t>ISODate</w:t>
+      </w:r>
+      <w:proofErr w:type="spellEnd"/>
+      <w:r>
+        <w:rPr>
+          <w:rFonts w:asciiTheme="minorHAnsi" w:hAnsiTheme="minorHAnsi" w:cstheme="minorHAnsi"/>
+          <w:sz w:val="20"/>
+          <w:szCs w:val="8"/>
+        </w:rPr>
+        <w:t>(</w:t>
       </w:r>
       <w:proofErr w:type="gramEnd"/>
       <w:r>
@@ -3627,8 +4509,18 @@
           <w:sz w:val="20"/>
           <w:szCs w:val="8"/>
         </w:rPr>
-        <w:t xml:space="preserve">  "stato": "in_coda</w:t>
-      </w:r>
+        <w:t xml:space="preserve">  "stato": "</w:t>
+      </w:r>
+      <w:proofErr w:type="spellStart"/>
+      <w:r>
+        <w:rPr>
+          <w:rFonts w:asciiTheme="minorHAnsi" w:hAnsiTheme="minorHAnsi" w:cstheme="minorHAnsi"/>
+          <w:sz w:val="20"/>
+          <w:szCs w:val="8"/>
+        </w:rPr>
+        <w:t>in_coda</w:t>
+      </w:r>
+      <w:proofErr w:type="spellEnd"/>
       <w:proofErr w:type="gramStart"/>
       <w:r>
         <w:rPr>
@@ -3662,8 +4554,27 @@
           <w:sz w:val="20"/>
           <w:szCs w:val="8"/>
         </w:rPr>
-        <w:t xml:space="preserve">  "dataCreazione": </w:t>
-      </w:r>
+        <w:t xml:space="preserve">  "</w:t>
+      </w:r>
+      <w:proofErr w:type="spellStart"/>
+      <w:r>
+        <w:rPr>
+          <w:rFonts w:asciiTheme="minorHAnsi" w:hAnsiTheme="minorHAnsi" w:cstheme="minorHAnsi"/>
+          <w:sz w:val="20"/>
+          <w:szCs w:val="8"/>
+        </w:rPr>
+        <w:t>dataCreazione</w:t>
+      </w:r>
+      <w:proofErr w:type="spellEnd"/>
+      <w:r>
+        <w:rPr>
+          <w:rFonts w:asciiTheme="minorHAnsi" w:hAnsiTheme="minorHAnsi" w:cstheme="minorHAnsi"/>
+          <w:sz w:val="20"/>
+          <w:szCs w:val="8"/>
+        </w:rPr>
+        <w:t xml:space="preserve">": </w:t>
+      </w:r>
+      <w:proofErr w:type="spellStart"/>
       <w:proofErr w:type="gramStart"/>
       <w:r>
         <w:rPr>
@@ -3671,7 +4582,16 @@
           <w:sz w:val="20"/>
           <w:szCs w:val="8"/>
         </w:rPr>
-        <w:t>ISODate(</w:t>
+        <w:t>ISODate</w:t>
+      </w:r>
+      <w:proofErr w:type="spellEnd"/>
+      <w:r>
+        <w:rPr>
+          <w:rFonts w:asciiTheme="minorHAnsi" w:hAnsiTheme="minorHAnsi" w:cstheme="minorHAnsi"/>
+          <w:sz w:val="20"/>
+          <w:szCs w:val="8"/>
+        </w:rPr>
+        <w:t>(</w:t>
       </w:r>
       <w:proofErr w:type="gramEnd"/>
       <w:r>
@@ -3726,6 +4646,7 @@
           <w:szCs w:val="8"/>
         </w:rPr>
       </w:pPr>
+      <w:proofErr w:type="spellStart"/>
       <w:r>
         <w:rPr>
           <w:rFonts w:asciiTheme="minorHAnsi" w:hAnsiTheme="minorHAnsi" w:cstheme="minorHAnsi"/>
@@ -3736,6 +4657,7 @@
         </w:rPr>
         <w:t>Catalog</w:t>
       </w:r>
+      <w:proofErr w:type="spellEnd"/>
       <w:r>
         <w:rPr>
           <w:rFonts w:asciiTheme="minorHAnsi" w:hAnsiTheme="minorHAnsi" w:cstheme="minorHAnsi"/>
@@ -3813,7 +4735,6 @@
           <w:sz w:val="20"/>
           <w:szCs w:val="8"/>
         </w:rPr>
-        <w:lastRenderedPageBreak/>
         <w:pict w14:anchorId="5DE7C604">
           <v:rect id="_x0000_i1030" style="width:0;height:1.5pt" o:hralign="center" o:hrstd="t" o:hr="t" fillcolor="#a0a0a0" stroked="f"/>
         </w:pict>
@@ -3841,6 +4762,7 @@
           <w:sz w:val="20"/>
           <w:szCs w:val="8"/>
         </w:rPr>
+        <w:lastRenderedPageBreak/>
         <w:t>SCELTE PROGETTUALI</w:t>
       </w:r>
     </w:p>
@@ -3868,7 +4790,43 @@
           <w:sz w:val="20"/>
           <w:szCs w:val="8"/>
         </w:rPr>
-        <w:t>È stata mantenuta una netta separazione tra frontend e backend per garantire chiarezza architetturale.</w:t>
+        <w:t xml:space="preserve">È stata mantenuta una netta separazione tra </w:t>
+      </w:r>
+      <w:proofErr w:type="spellStart"/>
+      <w:r>
+        <w:rPr>
+          <w:rFonts w:asciiTheme="minorHAnsi" w:hAnsiTheme="minorHAnsi" w:cstheme="minorHAnsi"/>
+          <w:sz w:val="20"/>
+          <w:szCs w:val="8"/>
+        </w:rPr>
+        <w:t>frontend</w:t>
+      </w:r>
+      <w:proofErr w:type="spellEnd"/>
+      <w:r>
+        <w:rPr>
+          <w:rFonts w:asciiTheme="minorHAnsi" w:hAnsiTheme="minorHAnsi" w:cstheme="minorHAnsi"/>
+          <w:sz w:val="20"/>
+          <w:szCs w:val="8"/>
+        </w:rPr>
+        <w:t xml:space="preserve"> e </w:t>
+      </w:r>
+      <w:proofErr w:type="spellStart"/>
+      <w:r>
+        <w:rPr>
+          <w:rFonts w:asciiTheme="minorHAnsi" w:hAnsiTheme="minorHAnsi" w:cstheme="minorHAnsi"/>
+          <w:sz w:val="20"/>
+          <w:szCs w:val="8"/>
+        </w:rPr>
+        <w:t>backend</w:t>
+      </w:r>
+      <w:proofErr w:type="spellEnd"/>
+      <w:r>
+        <w:rPr>
+          <w:rFonts w:asciiTheme="minorHAnsi" w:hAnsiTheme="minorHAnsi" w:cstheme="minorHAnsi"/>
+          <w:sz w:val="20"/>
+          <w:szCs w:val="8"/>
+        </w:rPr>
+        <w:t xml:space="preserve"> per garantire chiarezza architetturale.</w:t>
       </w:r>
       <w:r>
         <w:rPr>
@@ -3877,7 +4835,43 @@
           <w:szCs w:val="8"/>
         </w:rPr>
         <w:br/>
-        <w:t>L’utilizzo di async/await ha reso il codice più leggibile e facile da mantenere.</w:t>
+        <w:t xml:space="preserve">L’utilizzo di </w:t>
+      </w:r>
+      <w:proofErr w:type="spellStart"/>
+      <w:r>
+        <w:rPr>
+          <w:rFonts w:asciiTheme="minorHAnsi" w:hAnsiTheme="minorHAnsi" w:cstheme="minorHAnsi"/>
+          <w:sz w:val="20"/>
+          <w:szCs w:val="8"/>
+        </w:rPr>
+        <w:t>async</w:t>
+      </w:r>
+      <w:proofErr w:type="spellEnd"/>
+      <w:r>
+        <w:rPr>
+          <w:rFonts w:asciiTheme="minorHAnsi" w:hAnsiTheme="minorHAnsi" w:cstheme="minorHAnsi"/>
+          <w:sz w:val="20"/>
+          <w:szCs w:val="8"/>
+        </w:rPr>
+        <w:t>/</w:t>
+      </w:r>
+      <w:proofErr w:type="spellStart"/>
+      <w:r>
+        <w:rPr>
+          <w:rFonts w:asciiTheme="minorHAnsi" w:hAnsiTheme="minorHAnsi" w:cstheme="minorHAnsi"/>
+          <w:sz w:val="20"/>
+          <w:szCs w:val="8"/>
+        </w:rPr>
+        <w:t>await</w:t>
+      </w:r>
+      <w:proofErr w:type="spellEnd"/>
+      <w:r>
+        <w:rPr>
+          <w:rFonts w:asciiTheme="minorHAnsi" w:hAnsiTheme="minorHAnsi" w:cstheme="minorHAnsi"/>
+          <w:sz w:val="20"/>
+          <w:szCs w:val="8"/>
+        </w:rPr>
+        <w:t xml:space="preserve"> ha reso il codice più leggibile e facile da mantenere.</w:t>
       </w:r>
       <w:r>
         <w:rPr>
@@ -3963,24 +4957,114 @@
           <w:sz w:val="20"/>
           <w:szCs w:val="8"/>
         </w:rPr>
-        <w:t>Il progetto FastFood ha permesso di applicare concretamente i concetti di sviluppo web full-stack. Sono state affrontate problematiche legate alla gestione delle API, alla modellazione dei dati, alla comunicazione client-server e alla progettazione dell’interfaccia utente.</w:t>
-      </w:r>
-    </w:p>
-    <w:p>
-      <w:pPr>
-        <w:rPr>
-          <w:rFonts w:asciiTheme="minorHAnsi" w:hAnsiTheme="minorHAnsi" w:cstheme="minorHAnsi"/>
-          <w:sz w:val="20"/>
-          <w:szCs w:val="8"/>
-        </w:rPr>
-      </w:pPr>
-      <w:r>
-        <w:rPr>
-          <w:rFonts w:asciiTheme="minorHAnsi" w:hAnsiTheme="minorHAnsi" w:cstheme="minorHAnsi"/>
-          <w:sz w:val="20"/>
-          <w:szCs w:val="8"/>
-        </w:rPr>
-        <w:t>L’esperienza ha permesso di comprendere l’importanza della coerenza tra frontend e backend e della corretta organizzazione del codice. Il lavoro collaborativo ha contribuito a migliorare la qualità complessiva del progetto.</w:t>
+        <w:t xml:space="preserve">Il progetto </w:t>
+      </w:r>
+      <w:proofErr w:type="spellStart"/>
+      <w:r>
+        <w:rPr>
+          <w:rFonts w:asciiTheme="minorHAnsi" w:hAnsiTheme="minorHAnsi" w:cstheme="minorHAnsi"/>
+          <w:sz w:val="20"/>
+          <w:szCs w:val="8"/>
+        </w:rPr>
+        <w:t>FastFood</w:t>
+      </w:r>
+      <w:proofErr w:type="spellEnd"/>
+      <w:r>
+        <w:rPr>
+          <w:rFonts w:asciiTheme="minorHAnsi" w:hAnsiTheme="minorHAnsi" w:cstheme="minorHAnsi"/>
+          <w:sz w:val="20"/>
+          <w:szCs w:val="8"/>
+        </w:rPr>
+        <w:t xml:space="preserve"> ha permesso di applicare concretamente i concetti di sviluppo web full-</w:t>
+      </w:r>
+      <w:proofErr w:type="spellStart"/>
+      <w:r>
+        <w:rPr>
+          <w:rFonts w:asciiTheme="minorHAnsi" w:hAnsiTheme="minorHAnsi" w:cstheme="minorHAnsi"/>
+          <w:sz w:val="20"/>
+          <w:szCs w:val="8"/>
+        </w:rPr>
+        <w:t>stack</w:t>
+      </w:r>
+      <w:proofErr w:type="spellEnd"/>
+      <w:r>
+        <w:rPr>
+          <w:rFonts w:asciiTheme="minorHAnsi" w:hAnsiTheme="minorHAnsi" w:cstheme="minorHAnsi"/>
+          <w:sz w:val="20"/>
+          <w:szCs w:val="8"/>
+        </w:rPr>
+        <w:t xml:space="preserve">. Sono state affrontate problematiche legate alla gestione delle API, alla modellazione dei dati, alla comunicazione </w:t>
+      </w:r>
+      <w:proofErr w:type="spellStart"/>
+      <w:r>
+        <w:rPr>
+          <w:rFonts w:asciiTheme="minorHAnsi" w:hAnsiTheme="minorHAnsi" w:cstheme="minorHAnsi"/>
+          <w:sz w:val="20"/>
+          <w:szCs w:val="8"/>
+        </w:rPr>
+        <w:t>client-server</w:t>
+      </w:r>
+      <w:proofErr w:type="spellEnd"/>
+      <w:r>
+        <w:rPr>
+          <w:rFonts w:asciiTheme="minorHAnsi" w:hAnsiTheme="minorHAnsi" w:cstheme="minorHAnsi"/>
+          <w:sz w:val="20"/>
+          <w:szCs w:val="8"/>
+        </w:rPr>
+        <w:t xml:space="preserve"> e alla progettazione dell’interfaccia utente.</w:t>
+      </w:r>
+    </w:p>
+    <w:p>
+      <w:pPr>
+        <w:rPr>
+          <w:rFonts w:asciiTheme="minorHAnsi" w:hAnsiTheme="minorHAnsi" w:cstheme="minorHAnsi"/>
+          <w:sz w:val="20"/>
+          <w:szCs w:val="8"/>
+        </w:rPr>
+      </w:pPr>
+      <w:r>
+        <w:rPr>
+          <w:rFonts w:asciiTheme="minorHAnsi" w:hAnsiTheme="minorHAnsi" w:cstheme="minorHAnsi"/>
+          <w:sz w:val="20"/>
+          <w:szCs w:val="8"/>
+        </w:rPr>
+        <w:t xml:space="preserve">L’esperienza ha permesso di comprendere l’importanza della coerenza tra </w:t>
+      </w:r>
+      <w:proofErr w:type="spellStart"/>
+      <w:r>
+        <w:rPr>
+          <w:rFonts w:asciiTheme="minorHAnsi" w:hAnsiTheme="minorHAnsi" w:cstheme="minorHAnsi"/>
+          <w:sz w:val="20"/>
+          <w:szCs w:val="8"/>
+        </w:rPr>
+        <w:t>frontend</w:t>
+      </w:r>
+      <w:proofErr w:type="spellEnd"/>
+      <w:r>
+        <w:rPr>
+          <w:rFonts w:asciiTheme="minorHAnsi" w:hAnsiTheme="minorHAnsi" w:cstheme="minorHAnsi"/>
+          <w:sz w:val="20"/>
+          <w:szCs w:val="8"/>
+        </w:rPr>
+        <w:t xml:space="preserve"> e </w:t>
+      </w:r>
+      <w:proofErr w:type="spellStart"/>
+      <w:r>
+        <w:rPr>
+          <w:rFonts w:asciiTheme="minorHAnsi" w:hAnsiTheme="minorHAnsi" w:cstheme="minorHAnsi"/>
+          <w:sz w:val="20"/>
+          <w:szCs w:val="8"/>
+        </w:rPr>
+        <w:t>backend</w:t>
+      </w:r>
+      <w:proofErr w:type="spellEnd"/>
+      <w:r>
+        <w:rPr>
+          <w:rFonts w:asciiTheme="minorHAnsi" w:hAnsiTheme="minorHAnsi" w:cstheme="minorHAnsi"/>
+          <w:sz w:val="20"/>
+          <w:szCs w:val="8"/>
+        </w:rPr>
+        <w:t xml:space="preserve"> e della corretta organizzazione del codice. Il lavoro collaborativo ha contribuito a migliorare la qualità complessiva del progetto.</w:t>
       </w:r>
     </w:p>
     <w:sectPr>

</xml_diff>